<commit_message>
Pulir Activity 2 tras verificación con agentes
- Neutraliza el comentario de Stock.java (NFLX cotiza en NASDAQ, no en AMEX)
- Aplica pulidos de redacción sugeridos en la documentación (voz más natural)
- Reconstruye .docx y PDF; el código y la salida (2.29%) no cambian

Co-Authored-By: Claude Opus 4.8 <noreply@anthropic.com>
Claude-Session: https://claude.ai/code/session_01V8FTv6GL1GGnkPBui9rwPG
</commit_message>
<xml_diff>
--- a/activity2-stock-report.docx
+++ b/activity2-stock-report.docx
@@ -253,7 +253,7 @@
           <w:szCs w:val="22"/>
           <w:rFonts w:ascii="Arial" w:cs="Arial" w:eastAsia="Arial" w:hAnsi="Arial"/>
         </w:rPr>
-        <w:t xml:space="preserve">This activity models a stock from the American Stock Exchange with an object-oriented approach. The program is split into two files: the Stock class, which holds the data and the behavior of a single stock, and a test program that creates one stock and reports its price change.</w:t>
+        <w:t xml:space="preserve">This activity models a stock from the American Stock Exchange with an object-oriented approach. The program is split into two files: the Stock class, which holds the data and behavior of a single stock, and a test program that creates one stock and reports its price change.</w:t>
       </w:r>
     </w:p>
     <w:p>
@@ -267,7 +267,7 @@
           <w:szCs w:val="22"/>
           <w:rFonts w:ascii="Arial" w:cs="Arial" w:eastAsia="Arial" w:hAnsi="Arial"/>
         </w:rPr>
-        <w:t xml:space="preserve">The Stock class keeps four private data fields: symbol and name (both String), and previousClosingPrice and currentPrice (both double). The constructor receives the symbol and the name when the object is created. The two prices are assigned afterward through setPreviousPrice and setNewPrice. The method getChangePercent applies the formula below, so the result is positive when the price rises and negative when it falls. A getter was added for each field to read the values from outside the class while the fields stay private, which keeps the object properly encapsulated.</w:t>
+        <w:t xml:space="preserve">The Stock class has four private data fields: symbol and name (both String), and previousClosingPrice and currentPrice (both double). The constructor receives the symbol and the name when the object is created. The two prices are assigned afterward through setPreviousPrice and setNewPrice. The method getChangePercent applies the formula below, so the result is positive when the price rises and negative when it falls. Each field also has a getter, so the values can be read from outside the class while the fields stay private and the object remains properly encapsulated.</w:t>
       </w:r>
     </w:p>
     <w:p>
@@ -407,7 +407,7 @@
                 <w:szCs w:val="17"/>
                 <w:rFonts w:ascii="Consolas" w:cs="Consolas" w:eastAsia="Consolas" w:hAnsi="Consolas"/>
               </w:rPr>
-              <w:t xml:space="preserve"> * Models a stock traded on the American Stock Exchange.</w:t>
+              <w:t xml:space="preserve"> * Models a stock, storing its data and computing its price change.</w:t>
             </w:r>
           </w:p>
           <w:p>

</xml_diff>